<commit_message>
docs(handoff): add §2.6 server-side clinical strip + update propagation table
- §2 header bumped 5→6 commits
- §2.6 explains the deterministic strip approach added in 89a8e9f and
  notes how it relates to optional structural fix in blog-core
- §3 monitoring: add log line to watch
- §5 decision queue: bump 5→6 with note about Option C deprecating both
  §2.5 and §2.6
- §8 commit graph: add 89a8e9f, update merge SHA reference
- §10.7 propagation table: add 2.6 row

Companion .docx regenerated.

https://claude.ai/code/session_013X4mDSo9o3uQXNNL9YqPjx
</commit_message>
<xml_diff>
--- a/docs/handoff-2026-05-07.docx
+++ b/docs/handoff-2026-05-07.docx
@@ -127,7 +127,7 @@
         <w:jc w:val="left"/>
       </w:pPr>
       <w:r>
-        <w:t>2. 본 세션 변경 (5건, main 머지 완료)</w:t>
+        <w:t>2. 본 세션 변경 (6건, main 머지 완료)</w:t>
       </w:r>
     </w:p>
     <w:p>
@@ -1336,6 +1336,413 @@
       </w:r>
       <w:r>
         <w:t xml:space="preserve"> 자체에서 "dental clinic setting" 같은 location-forcing 어휘를 제거하고, 토픽 anchoring만 유지. 양쪽 앱(next-app, public-app)에 동일하게 영향. 이 결정은 시니어가 내리는 게 맞음</w:t>
+      </w:r>
+    </w:p>
+    <w:p>
+      <w:pPr>
+        <w:pBdr>
+          <w:bottom w:val="single" w:sz="6" w:space="1" w:color="BBBBBB"/>
+        </w:pBdr>
+      </w:pPr>
+    </w:p>
+    <w:p>
+      <w:pPr>
+        <w:pStyle w:val="Heading3"/>
+        <w:jc w:val="left"/>
+      </w:pPr>
+      <w:r>
+        <w:t xml:space="preserve">2.6 </w:t>
+      </w:r>
+      <w:r>
+        <w:rPr>
+          <w:rFonts w:ascii="Consolas" w:hAnsi="Consolas"/>
+          <w:color w:val="C7254E"/>
+          <w:sz w:val="20"/>
+        </w:rPr>
+        <w:t>89a8e9f</w:t>
+      </w:r>
+      <w:r>
+        <w:t xml:space="preserve"> — 비임상 행동 시 임상 segment deterministic strip (옵션 A)</w:t>
+      </w:r>
+    </w:p>
+    <w:p>
+      <w:r>
+        <w:rPr>
+          <w:b/>
+        </w:rPr>
+        <w:t>파일</w:t>
+      </w:r>
+      <w:r>
+        <w:t xml:space="preserve">: </w:t>
+      </w:r>
+      <w:r>
+        <w:rPr>
+          <w:rFonts w:ascii="Consolas" w:hAnsi="Consolas"/>
+          <w:color w:val="C7254E"/>
+          <w:sz w:val="20"/>
+        </w:rPr>
+        <w:t>next-app/app/api/image/route.ts</w:t>
+      </w:r>
+      <w:r>
+        <w:t xml:space="preserve"> (+59/−4)</w:t>
+      </w:r>
+    </w:p>
+    <w:p>
+      <w:r>
+        <w:rPr>
+          <w:b/>
+        </w:rPr>
+        <w:t>문제</w:t>
+      </w:r>
+      <w:r>
+        <w:t xml:space="preserve">: 2.5 (HARD OVERRIDE) 적용 후에도 일부 케이스에서 진료의자 이미지 재발. 추적 결과 진짜 원인은 </w:t>
+      </w:r>
+      <w:r>
+        <w:rPr>
+          <w:b/>
+        </w:rPr>
+        <w:t>blog-core/buildImagePrompt가 임상 묘사를 baked in해서 보냄</w:t>
+      </w:r>
+      <w:r>
+        <w:t>:</w:t>
+      </w:r>
+    </w:p>
+    <w:p>
+      <w:pPr>
+        <w:pStyle w:val="ListNumber"/>
+      </w:pPr>
+      <w:r>
+        <w:rPr>
+          <w:rFonts w:ascii="Consolas" w:hAnsi="Consolas"/>
+          <w:color w:val="C7254E"/>
+          <w:sz w:val="20"/>
+        </w:rPr>
+        <w:t>categoryHints['치과'] = 'dental clinic setting, modern minimalist Korean dental office'</w:t>
+      </w:r>
+      <w:r>
+        <w:t xml:space="preserve"> — prefix</w:t>
+      </w:r>
+    </w:p>
+    <w:p>
+      <w:pPr>
+        <w:pStyle w:val="ListNumber"/>
+      </w:pPr>
+      <w:r>
+        <w:rPr>
+          <w:rFonts w:ascii="Consolas" w:hAnsi="Consolas"/>
+          <w:color w:val="C7254E"/>
+          <w:sz w:val="20"/>
+        </w:rPr>
+        <w:t>SCENE_VARIANTS</w:t>
+      </w:r>
+      <w:r>
+        <w:t xml:space="preserve"> 6개 모두 임상 (</w:t>
+      </w:r>
+      <w:r>
+        <w:rPr>
+          <w:rFonts w:ascii="Consolas" w:hAnsi="Consolas"/>
+          <w:color w:val="C7254E"/>
+          <w:sz w:val="20"/>
+        </w:rPr>
+        <w:t>'examination chair'</w:t>
+      </w:r>
+      <w:r>
+        <w:t xml:space="preserve">, </w:t>
+      </w:r>
+      <w:r>
+        <w:rPr>
+          <w:rFonts w:ascii="Consolas" w:hAnsi="Consolas"/>
+          <w:color w:val="C7254E"/>
+          <w:sz w:val="20"/>
+        </w:rPr>
+        <w:t>'close-up of dental tools and procedure'</w:t>
+      </w:r>
+      <w:r>
+        <w:t xml:space="preserve">, </w:t>
+      </w:r>
+      <w:r>
+        <w:rPr>
+          <w:rFonts w:ascii="Consolas" w:hAnsi="Consolas"/>
+          <w:color w:val="C7254E"/>
+          <w:sz w:val="20"/>
+        </w:rPr>
+        <w:t>'wide view of bright modern clinic interior'</w:t>
+      </w:r>
+      <w:r>
+        <w:t xml:space="preserve"> 등). </w:t>
+      </w:r>
+      <w:r>
+        <w:rPr>
+          <w:rFonts w:ascii="Consolas" w:hAnsi="Consolas"/>
+          <w:color w:val="C7254E"/>
+          <w:sz w:val="20"/>
+        </w:rPr>
+        <w:t>sectionIndex &gt;= 2</w:t>
+      </w:r>
+      <w:r>
+        <w:t>면 alt 옆에 그대로 append</w:t>
+      </w:r>
+    </w:p>
+    <w:p>
+      <w:pPr>
+        <w:pStyle w:val="ListNumber"/>
+      </w:pPr>
+      <w:r>
+        <w:rPr>
+          <w:rFonts w:ascii="Consolas" w:hAnsi="Consolas"/>
+          <w:color w:val="C7254E"/>
+          <w:sz w:val="20"/>
+        </w:rPr>
+        <w:t>'Korean patient context'</w:t>
+      </w:r>
+      <w:r>
+        <w:t xml:space="preserve"> suffix — 환자 framing 강제</w:t>
+      </w:r>
+    </w:p>
+    <w:p>
+      <w:r>
+        <w:t xml:space="preserve">이 </w:t>
+      </w:r>
+      <w:r>
+        <w:rPr>
+          <w:b/>
+        </w:rPr>
+        <w:t>구체 묘사</w:t>
+      </w:r>
+      <w:r>
+        <w:t>가 모델에서 abstract HARD OVERRIDE보다 더 강하게 받아들여져 우회.</w:t>
+      </w:r>
+    </w:p>
+    <w:p>
+      <w:r>
+        <w:rPr>
+          <w:b/>
+        </w:rPr>
+        <w:t>변경</w:t>
+      </w:r>
+      <w:r>
+        <w:t xml:space="preserve">: </w:t>
+      </w:r>
+      <w:r>
+        <w:rPr>
+          <w:rFonts w:ascii="Consolas" w:hAnsi="Consolas"/>
+          <w:color w:val="C7254E"/>
+          <w:sz w:val="20"/>
+        </w:rPr>
+        <w:t>body.prompt</w:t>
+      </w:r>
+      <w:r>
+        <w:t>를 모델에 보내기 전 서버에서 deterministic 처리:</w:t>
+      </w:r>
+    </w:p>
+    <w:p>
+      <w:pPr>
+        <w:pStyle w:val="ListNumber"/>
+      </w:pPr>
+      <w:r>
+        <w:rPr>
+          <w:b/>
+        </w:rPr>
+        <w:t>비임상 행동 키워드 감지</w:t>
+      </w:r>
+      <w:r>
+        <w:t xml:space="preserve"> (한·영 정규식 11개): 양치/치솔질, 치실, 치간 칫솔, 가글/구강세정, 식사/먹/섭취, 음용/마시, 산책, 운동/스트레칭/재활, 수면/잠, 복용/약, 스킨케어/세안</w:t>
+      </w:r>
+    </w:p>
+    <w:p>
+      <w:pPr>
+        <w:pStyle w:val="ListNumber"/>
+      </w:pPr>
+      <w:r>
+        <w:t xml:space="preserve">매치 시 </w:t>
+      </w:r>
+      <w:r>
+        <w:rPr>
+          <w:rFonts w:ascii="Consolas" w:hAnsi="Consolas"/>
+          <w:color w:val="C7254E"/>
+          <w:sz w:val="20"/>
+        </w:rPr>
+        <w:t>body.prompt</w:t>
+      </w:r>
+      <w:r>
+        <w:t xml:space="preserve">를 쉼표 split → </w:t>
+      </w:r>
+      <w:r>
+        <w:rPr>
+          <w:b/>
+        </w:rPr>
+        <w:t>임상 keyword 포함 segment 제거</w:t>
+      </w:r>
+    </w:p>
+    <w:p>
+      <w:pPr>
+        <w:pStyle w:val="ListBullet"/>
+      </w:pPr>
+      <w:r>
+        <w:t xml:space="preserve">keyword pattern: </w:t>
+      </w:r>
+      <w:r>
+        <w:rPr>
+          <w:rFonts w:ascii="Consolas" w:hAnsi="Consolas"/>
+          <w:color w:val="C7254E"/>
+          <w:sz w:val="20"/>
+        </w:rPr>
+        <w:t>clinic | dental {office|tools|scan|procedure|chair} | examination {chair|area|environment|setting|room} | operatory | consultation {environment|setting|room} | treatment {environment|chair|setting|room} | reception desk | X-ray imaging | dentist {explaining|focused} | patient {consultation|receiving treatment|context} | medical clinic interior</w:t>
+      </w:r>
+    </w:p>
+    <w:p>
+      <w:pPr>
+        <w:pStyle w:val="ListNumber"/>
+      </w:pPr>
+      <w:r>
+        <w:t>alt 텍스트 segment 와 중립 segment(lighting·atmosphere)는 보존</w:t>
+      </w:r>
+    </w:p>
+    <w:p>
+      <w:pPr>
+        <w:pStyle w:val="ListNumber"/>
+      </w:pPr>
+      <w:r>
+        <w:t>모든 segment가 임상으로 분류되어 빈 문자열이 되면 원본 유지 (false-positive 가드)</w:t>
+      </w:r>
+    </w:p>
+    <w:p>
+      <w:pPr>
+        <w:pStyle w:val="ListNumber"/>
+      </w:pPr>
+      <w:r>
+        <w:t xml:space="preserve">처리 사실은 </w:t>
+      </w:r>
+      <w:r>
+        <w:rPr>
+          <w:rFonts w:ascii="Consolas" w:hAnsi="Consolas"/>
+          <w:color w:val="C7254E"/>
+          <w:sz w:val="20"/>
+        </w:rPr>
+        <w:t>[BLOG_IMAGE] 비임상 행동 감지 → 임상 segment strip (N→M chars)</w:t>
+      </w:r>
+      <w:r>
+        <w:t xml:space="preserve"> 로그로 가시화</w:t>
+      </w:r>
+    </w:p>
+    <w:p>
+      <w:r>
+        <w:rPr>
+          <w:b/>
+        </w:rPr>
+        <w:t>예시</w:t>
+      </w:r>
+      <w:r>
+        <w:t>:</w:t>
+      </w:r>
+    </w:p>
+    <w:p>
+      <w:pPr>
+        <w:pStyle w:val="ListBullet"/>
+      </w:pPr>
+      <w:r>
+        <w:t xml:space="preserve">Before: </w:t>
+      </w:r>
+      <w:r>
+        <w:rPr>
+          <w:rFonts w:ascii="Consolas" w:hAnsi="Consolas"/>
+          <w:color w:val="C7254E"/>
+          <w:sz w:val="20"/>
+        </w:rPr>
+        <w:t>dental clinic setting, modern minimalist Korean dental office, 회복기 죽 식사, wide view of bright modern clinic interior, examination chair, soft natural light, Korean patient context, warm approachable atmosphere</w:t>
+      </w:r>
+    </w:p>
+    <w:p>
+      <w:pPr>
+        <w:pStyle w:val="ListBullet"/>
+      </w:pPr>
+      <w:r>
+        <w:t xml:space="preserve">After: </w:t>
+      </w:r>
+      <w:r>
+        <w:rPr>
+          <w:rFonts w:ascii="Consolas" w:hAnsi="Consolas"/>
+          <w:color w:val="C7254E"/>
+          <w:sz w:val="20"/>
+        </w:rPr>
+        <w:t>회복기 죽 식사, soft natural light, warm approachable atmosphere</w:t>
+      </w:r>
+    </w:p>
+    <w:p>
+      <w:r>
+        <w:rPr>
+          <w:b/>
+        </w:rPr>
+        <w:t>롤백</w:t>
+      </w:r>
+      <w:r>
+        <w:t xml:space="preserve">: revert commit </w:t>
+      </w:r>
+      <w:r>
+        <w:rPr>
+          <w:rFonts w:ascii="Consolas" w:hAnsi="Consolas"/>
+          <w:color w:val="C7254E"/>
+          <w:sz w:val="20"/>
+        </w:rPr>
+        <w:t>89a8e9f</w:t>
+      </w:r>
+      <w:r>
+        <w:t xml:space="preserve">. 위치는 </w:t>
+      </w:r>
+      <w:r>
+        <w:rPr>
+          <w:rFonts w:ascii="Consolas" w:hAnsi="Consolas"/>
+          <w:color w:val="C7254E"/>
+          <w:sz w:val="20"/>
+        </w:rPr>
+        <w:t>route.ts</w:t>
+      </w:r>
+      <w:r>
+        <w:t xml:space="preserve"> POST handler 위에 module-level helpers + isBlogMode 가드 안에서만 적용.</w:t>
+      </w:r>
+    </w:p>
+    <w:p>
+      <w:r>
+        <w:rPr>
+          <w:b/>
+        </w:rPr>
+        <w:t>모니터링</w:t>
+      </w:r>
+      <w:r>
+        <w:t xml:space="preserve">: Vercel 로그에서 </w:t>
+      </w:r>
+      <w:r>
+        <w:rPr>
+          <w:rFonts w:ascii="Consolas" w:hAnsi="Consolas"/>
+          <w:color w:val="C7254E"/>
+          <w:sz w:val="20"/>
+        </w:rPr>
+        <w:t>[BLOG_IMAGE] 비임상 행동 감지</w:t>
+      </w:r>
+      <w:r>
+        <w:t xml:space="preserve"> 라인 빈도 추적. 잦으면 옵션 A가 살리고 있다는 증거. 블로그 본문에서 임상 토픽 글의 임상 segment가 잘못 strip되는 false-positive 케이스 (코드는 isNonClinicalAction이 참일 때만 실행되므로 이론상 없음, 실측 확인 필요).</w:t>
+      </w:r>
+    </w:p>
+    <w:p>
+      <w:r>
+        <w:rPr>
+          <w:b/>
+        </w:rPr>
+        <w:t>옵션 C(blog-core 직접 정리)와의 관계</w:t>
+      </w:r>
+      <w:r>
+        <w:t>: 시니어가 buildImagePrompt 자체를 정리하면(</w:t>
+      </w:r>
+      <w:r>
+        <w:rPr>
+          <w:rFonts w:ascii="Consolas" w:hAnsi="Consolas"/>
+          <w:color w:val="C7254E"/>
+          <w:sz w:val="20"/>
+        </w:rPr>
+        <w:t>categoryHints</w:t>
+      </w:r>
+      <w:r>
+        <w:t xml:space="preserve"> location-free화 + SCENE_VARIANTS action-aware화) 본 strip은 의미가 줄어듦. 그때 본 helper 제거 가능.</w:t>
       </w:r>
     </w:p>
     <w:p>
@@ -1657,6 +2064,52 @@
           </w:p>
         </w:tc>
       </w:tr>
+      <w:tr>
+        <w:tc>
+          <w:tcPr>
+            <w:tcW w:type="dxa" w:w="2880"/>
+            <w:vAlign w:val="top"/>
+          </w:tcPr>
+          <w:p>
+            <w:r/>
+            <w:r>
+              <w:t>비임상 strip 발동률</w:t>
+            </w:r>
+          </w:p>
+        </w:tc>
+        <w:tc>
+          <w:tcPr>
+            <w:tcW w:type="dxa" w:w="2880"/>
+            <w:vAlign w:val="top"/>
+          </w:tcPr>
+          <w:p>
+            <w:r/>
+            <w:r>
+              <w:t xml:space="preserve">Vercel 로그 </w:t>
+            </w:r>
+            <w:r>
+              <w:rPr>
+                <w:rFonts w:ascii="Consolas" w:hAnsi="Consolas"/>
+                <w:color w:val="C7254E"/>
+                <w:sz w:val="20"/>
+              </w:rPr>
+              <w:t>[BLOG_IMAGE] 비임상 행동 감지 → 임상 segment strip (N→M chars)</w:t>
+            </w:r>
+            <w:r>
+              <w:t xml:space="preserve"> 빈도 — 일평균 5건 이상이면 patch 가 실제로 살리고 있다는 증거</w:t>
+            </w:r>
+          </w:p>
+        </w:tc>
+        <w:tc>
+          <w:tcPr>
+            <w:tcW w:type="dxa" w:w="2880"/>
+            <w:vAlign w:val="top"/>
+          </w:tcPr>
+          <w:p>
+            <w:r/>
+          </w:p>
+        </w:tc>
+      </w:tr>
     </w:tbl>
     <w:p/>
     <w:p>
@@ -2210,7 +2663,7 @@
         <w:t>public-app 변경 포팅 정책</w:t>
       </w:r>
       <w:r>
-        <w:t xml:space="preserve"> — 본 세션 5건 중 3건(2.1, 2.4, 2.5)은 public-app에도 동일 버그/개선 적용 가능. 일괄 포팅 vs 케이스별 검토?</w:t>
+        <w:t xml:space="preserve"> — 본 세션 6건 중 4건(2.1, 2.4, 2.5, 2.6)은 public-app에도 동일 버그/개선 적용 가능. 일괄 포팅 vs 케이스별 검토?</w:t>
       </w:r>
     </w:p>
     <w:p>
@@ -2240,7 +2693,7 @@
         <w:t>categoryHints</w:t>
       </w:r>
       <w:r>
-        <w:t xml:space="preserve"> location-forcing 제거가 가장 클린한 수정. 양 앱 동시 영향 → 시니어 결정 사안</w:t>
+        <w:t xml:space="preserve"> location-forcing + clinical SCENE_VARIANTS 정리(옵션 C)가 가장 클린한 수정. 양 앱 동시 영향 → 시니어 결정 사안. 옵션 C 채택 시 2.5(HARD OVERRIDE)·2.6(strip helper) 자연 deprecate 가능</w:t>
       </w:r>
     </w:p>
     <w:p>
@@ -2495,6 +2948,8 @@
           <w:rFonts w:ascii="Consolas" w:hAnsi="Consolas"/>
           <w:sz w:val="18"/>
         </w:rPr>
+        <w:t>* 89a8e9f fix(image): server-side strip of clinical segments for non-clinical actions</w:t>
+        <w:br/>
         <w:t>* b2401af fix(image): add HARD OVERRIDE block after body.prompt to defeat upstream clinic-bias</w:t>
         <w:br/>
         <w:t>* 10c11c5 fix(image): pick blog image location by action, not by medical topic</w:t>
@@ -2516,10 +2971,10 @@
           <w:color w:val="C7254E"/>
           <w:sz w:val="20"/>
         </w:rPr>
-        <w:t>0c67de2</w:t>
-      </w:r>
-      <w:r>
-        <w:t xml:space="preserve"> (시점: 2026-05-07).</w:t>
+        <w:t>044ec6e</w:t>
+      </w:r>
+      <w:r>
+        <w:t xml:space="preserve"> (시점: 2026-05-07. 본 §2.6 머지 후 갱신됨).</w:t>
       </w:r>
     </w:p>
     <w:p>
@@ -7964,6 +8419,56 @@
           </w:p>
         </w:tc>
       </w:tr>
+      <w:tr>
+        <w:tc>
+          <w:tcPr>
+            <w:tcW w:type="dxa" w:w="2160"/>
+            <w:vAlign w:val="top"/>
+          </w:tcPr>
+          <w:p>
+            <w:r/>
+            <w:r>
+              <w:t>2.6 비임상 strip helper</w:t>
+            </w:r>
+          </w:p>
+        </w:tc>
+        <w:tc>
+          <w:tcPr>
+            <w:tcW w:type="dxa" w:w="2160"/>
+            <w:vAlign w:val="top"/>
+          </w:tcPr>
+          <w:p>
+            <w:r/>
+            <w:r>
+              <w:t>✅</w:t>
+            </w:r>
+          </w:p>
+        </w:tc>
+        <w:tc>
+          <w:tcPr>
+            <w:tcW w:type="dxa" w:w="2160"/>
+            <w:vAlign w:val="top"/>
+          </w:tcPr>
+          <w:p>
+            <w:r/>
+            <w:r>
+              <w:t>❌</w:t>
+            </w:r>
+          </w:p>
+        </w:tc>
+        <w:tc>
+          <w:tcPr>
+            <w:tcW w:type="dxa" w:w="2160"/>
+            <w:vAlign w:val="top"/>
+          </w:tcPr>
+          <w:p>
+            <w:r/>
+            <w:r>
+              <w:t>동일 개선 필요 (또는 옵션 C로 한 번에 정리)</w:t>
+            </w:r>
+          </w:p>
+        </w:tc>
+      </w:tr>
     </w:tbl>
     <w:p/>
     <w:p>
@@ -7971,7 +8476,7 @@
         <w:rPr>
           <w:b/>
         </w:rPr>
-        <w:t>구조적 정정 후보 (양쪽 동시 영향)</w:t>
+        <w:t>구조적 정정 후보 (양쪽 동시 영향, 옵션 C)</w:t>
       </w:r>
       <w:r>
         <w:t xml:space="preserve">: </w:t>
@@ -7996,8 +8501,13 @@
         <w:t>buildImagePrompt</w:t>
       </w:r>
       <w:r>
-        <w:t xml:space="preserve"> </w:t>
-      </w:r>
+        <w:t xml:space="preserve"> 정리:</w:t>
+      </w:r>
+    </w:p>
+    <w:p>
+      <w:pPr>
+        <w:pStyle w:val="ListBullet"/>
+      </w:pPr>
       <w:r>
         <w:rPr>
           <w:rFonts w:ascii="Consolas" w:hAnsi="Consolas"/>
@@ -8007,7 +8517,88 @@
         <w:t>categoryHints</w:t>
       </w:r>
       <w:r>
-        <w:t>에서 location-forcing 어휘 제거 — 시니어 결정 필요</w:t>
+        <w:t xml:space="preserve"> 에서 location-forcing 어휘 제거 → 토픽-only anchoring (예: </w:t>
+      </w:r>
+      <w:r>
+        <w:rPr>
+          <w:rFonts w:ascii="Consolas" w:hAnsi="Consolas"/>
+          <w:color w:val="C7254E"/>
+          <w:sz w:val="20"/>
+        </w:rPr>
+        <w:t>'치과'</w:t>
+      </w:r>
+      <w:r>
+        <w:t xml:space="preserve"> → </w:t>
+      </w:r>
+      <w:r>
+        <w:rPr>
+          <w:rFonts w:ascii="Consolas" w:hAnsi="Consolas"/>
+          <w:color w:val="C7254E"/>
+          <w:sz w:val="20"/>
+        </w:rPr>
+        <w:t>'Korean dental health context'</w:t>
+      </w:r>
+      <w:r>
+        <w:t>)</w:t>
+      </w:r>
+    </w:p>
+    <w:p>
+      <w:pPr>
+        <w:pStyle w:val="ListBullet"/>
+      </w:pPr>
+      <w:r>
+        <w:rPr>
+          <w:rFonts w:ascii="Consolas" w:hAnsi="Consolas"/>
+          <w:color w:val="C7254E"/>
+          <w:sz w:val="20"/>
+        </w:rPr>
+        <w:t>SCENE_VARIANTS</w:t>
+      </w:r>
+      <w:r>
+        <w:t xml:space="preserve"> 를 action-aware 로 — alt 키워드 감지 후 home/clinic 분기, 또는 SCENE_VARIANTS 자체 폐기</w:t>
+      </w:r>
+    </w:p>
+    <w:p>
+      <w:pPr>
+        <w:pStyle w:val="ListBullet"/>
+      </w:pPr>
+      <w:r>
+        <w:rPr>
+          <w:rFonts w:ascii="Consolas" w:hAnsi="Consolas"/>
+          <w:color w:val="C7254E"/>
+          <w:sz w:val="20"/>
+        </w:rPr>
+        <w:t>'Korean patient context'</w:t>
+      </w:r>
+      <w:r>
+        <w:t xml:space="preserve"> → </w:t>
+      </w:r>
+      <w:r>
+        <w:rPr>
+          <w:rFonts w:ascii="Consolas" w:hAnsi="Consolas"/>
+          <w:color w:val="C7254E"/>
+          <w:sz w:val="20"/>
+        </w:rPr>
+        <w:t>'Korean adult subject'</w:t>
+      </w:r>
+      <w:r>
+        <w:t xml:space="preserve"> 같은 액션 중립 표현</w:t>
+      </w:r>
+    </w:p>
+    <w:p>
+      <w:pPr>
+        <w:pStyle w:val="ListBullet"/>
+      </w:pPr>
+      <w:r>
+        <w:t>위 변경 시 next-app 의 §2.5 HARD OVERRIDE + §2.6 strip helper 모두 의미 약화 → 정리 가능</w:t>
+      </w:r>
+    </w:p>
+    <w:p>
+      <w:pPr>
+        <w:pStyle w:val="ListBullet"/>
+      </w:pPr>
+      <w:r>
+        <w:t>시니어 결정 필요</w:t>
       </w:r>
     </w:p>
     <w:p>

</xml_diff>